<commit_message>
feat(forensics): rumuskan 4 usulan topik disertasi unggulan bidang Digital Forensik untuk Pak Hario
</commit_message>
<xml_diff>
--- a/03_DRAFT_PROPOSAL_RESMI_PDIK/Rencana_Proposal_Disertasi_Hario_Jati_Setyadi_PDIK_UDINUS.docx
+++ b/03_DRAFT_PROPOSAL_RESMI_PDIK/Rencana_Proposal_Disertasi_Hario_Jati_Setyadi_PDIK_UDINUS.docx
@@ -78,7 +78,7 @@
                 <w:i/>
                 <w:sz w:val="19"/>
               </w:rPr>
-              <w:t>Dokumen ini merupakan DRAF CONTOH PERCONTOHAN berbasis Usulan Topik 1 (Adaptive UI &amp; Real-Time Technostress Detection) sebagai gambaran format naskah resmi PDIK UDINUS. Saat ini calon peneliti (Pak Hario Jati Setyadi) masih dalam tahap mempertimbangkan 4 alternatif topik unggulan. Setelah topik definitif dipilih, naskah final resmi akan disusun ulang secara komprehensif mengikuti topik pilihan akhir.</w:t>
+              <w:t>Dokumen ini merupakan DRAF CONTOH PERCONTOHAN berbasis Usulan Topik 1 (Digital Forensik Cloud Microservices &amp; GNN) sesuai minat utama Pak Hario Jati Setyadi di bidang DIGITAL FORENSIK. Saat ini calon peneliti sedang mempertimbangkan 4 alternatif topik digital forensik. Setelah topik definitif dipilih, naskah final resmi akan disesuaikan secara menyeluruh mengikuti topik pilihan akhir.</w:t>
             </w:r>
           </w:p>
         </w:tc>
@@ -143,7 +143,7 @@
                 <w:i w:val="0"/>
                 <w:sz w:val="21"/>
               </w:rPr>
-              <w:t>Kerangka Kerja Antarmuka Pengguna Adaptif Cerdas Berbasis Deteksi Beban Kognitif dan Technostress Secara Real-Time Menggunakan Deep Neural Networks</w:t>
+              <w:t>Kerangka Kerja Investigasi Forensik Digital Otonom Berbasis Deep Graph Learning untuk Rekonstruksi Jejak Serangan Multi-Tahap pada Lingkungan Cloud Microservices</w:t>
             </w:r>
           </w:p>
         </w:tc>
@@ -191,7 +191,7 @@
                 <w:i/>
                 <w:sz w:val="21"/>
               </w:rPr>
-              <w:t>Intelligent Adaptive User Interface Framework Based on Real-Time Cognitive Load and Technostress Detection Using Deep Neural Networks</w:t>
+              <w:t>Autonomous Digital Forensics Investigation Framework Based on Deep Graph Learning for Multi-Stage Attack Reconstruction in Cloud Microservices Environments</w:t>
             </w:r>
           </w:p>
         </w:tc>
@@ -437,7 +437,7 @@
                 <w:i w:val="0"/>
                 <w:sz w:val="19"/>
               </w:rPr>
-              <w:t>Human-Computer Interaction (HCI), Intelligent Systems &amp; Software Architecture</w:t>
+              <w:t>Digital Forensics, Cloud Security, &amp; Applied Deep Learning</w:t>
             </w:r>
           </w:p>
         </w:tc>
@@ -521,7 +521,7 @@
           <w:i w:val="0"/>
           <w:sz w:val="24"/>
         </w:rPr>
-        <w:t>Dalam era transformasi digital yang masif, adopsi sistem informasi enterprise pada instansi pemerintahan (SPBE), institusi perbankan, dan perguruan tinggi telah menuntut pengguna manusia berinteraksi dengan antarmuka perangkat lunak yang memiliki kompleksitas tata kelola dan alur data yang sangat tinggi. Fenomena ini memicu timbulnya Technostress—kondisi tekanan psikologis dan beban kognitif berlebih (cognitive overload) yang dialami pengguna akibat tuntutan adaptasi teknologi yang terus-menerus.</w:t>
+        <w:t>Transformasi digital skala masif pada instansi pemerintahan (SPBE), perbankan, dan sektor industri strategis telah mendorong migrasi infrastruktur sistem informasi ke arsitektur Cloud-Native Microservices berbasis kontainer (Docker dan Kubernetes). Penggunaan kontainer memberikan fleksibilitas tinggi dan efisiensi sumber daya, namun memunculkan krisis fundamental dalam bidang Digital Forensics dan Incident Response:</w:t>
       </w:r>
     </w:p>
     <w:p>
@@ -536,7 +536,7 @@
           <w:i w:val="0"/>
           <w:sz w:val="24"/>
         </w:rPr>
-        <w:t>Meskipun prinsip perancangan antarmuka pengguna (UI/UX) telah mengadopsi standar Design Thinking dan User-Centered Design (UCD), implementasi antarmuka saat ini menghadapi tiga kelemahan mendasar:</w:t>
+        <w:t>1. Sifat Kontainer yang Sementara dan Mudah Hilang (Ephemeral Nature): Kontainer cloud dirancang untuk dapat dibuat, dimodifikasi, dan dimusnahkan dalam hitungan detik. Ketika penyerang siber berhasil menyusup (misalnya melalui teknik container breakout, eksploitasi API, atau injeksi payload), penyerang dapat menghapus kontainer target seketika. Metodologi forensik digital tradisional (dead-box forensics) yang mengandalkan analisis citra disk permanen menjadi tidak dapat digunakan (loss of forensic storage artifacts).</w:t>
       </w:r>
     </w:p>
     <w:p>
@@ -551,7 +551,7 @@
           <w:i w:val="0"/>
           <w:sz w:val="24"/>
         </w:rPr>
-        <w:t>1. Antarmuka Statis yang Kaku (Context-Blind User Interface): Tampilan antarmuka sistem informasi umumnya bersifat statis dan tidak peka terhadap dinamika psikologis pengguna. Ketika pengguna mulai mengalami kelelahan mental atau kebingungan kognitif, antarmuka tetap menampilkan kepadatan visual (visual clutter) dan alur formulir yang rumit, sehingga memicu peningkatan tingkat kesalahan manusia (human error rate) dan penurunan kepuasan kerja.</w:t>
+        <w:t>2. Ledakan Volume dan Kerumitan Log Audit (Log Explosion &amp; Dependency Chaos): Dalam klaster microservices, jutaan rekaman peristiwa kernel (system calls, process creation, file I/O, network socket transactions) dihasilkan setiap menit. Penyelidik forensik manusia mengalami hambatan luar biasa untuk menyortir data log yang sangat masif (information overload) guna menemukan jejak kejahatan yang sesungguhnya.</w:t>
       </w:r>
     </w:p>
     <w:p>
@@ -566,7 +566,7 @@
           <w:i w:val="0"/>
           <w:sz w:val="24"/>
         </w:rPr>
-        <w:t>2. Keterbatasan Evaluasi Technostress Tradisional yang Bersifat Pasif: Sebagian besar penelitian empiris di bidang Human-Computer Interaction (HCI) dan sistem informasi selama ini hanya mengukur technostress secara retrospektif pasca-aktivitas menggunakan instrumen kuesioner berskala Likert (seperti SEM-PLS). Pendekatan ini tidak mampu mendeteksi timbulnya stres saat sistem sedang digunakan (runtime), sehingga tidak memungkinkan dilakukannya intervensi mitigasi secara real-time.</w:t>
+        <w:t>3. Ketiadaan Rekonstruksi Rantai Kausalitas Serangan Multi-Tahap (Multi-Stage Attack Storyline Loss): Serangan siber tingkat lanjut (Advanced Persistent Threat / APT) umumnya berlangsung secara bertahap dan berpindah secara lateral (lateral movement) antar-kontainer. Diperlukan pemodelan relasi kausalitas proses (System Provenance Graphs) yang terstruktur dan mampu dianalisis secara cerdas oleh model Deep Graph Learning.</w:t>
       </w:r>
     </w:p>
     <w:p>
@@ -581,22 +581,7 @@
           <w:i w:val="0"/>
           <w:sz w:val="24"/>
         </w:rPr>
-        <w:t>3. Peluang Telemetri Perilaku Non-Invasif yang Belum Dioptimalkan: Metode deteksi stres fisiologis menggunakan sensor invasif (seperti EEG headset atau sensor galvanic skin response) sangat tidak praktis, mahal, dan mengganggu kenyamanan kerja harian. Sebaliknya, dinamika ketukan tombol (keystroke dynamics) serta anomali pergerakan kursor tetikus (mouse trajectory jitter and speed) menyajikan penanda biometrik perilaku non-invasif yang sangat potensial untuk diekstraksi menggunakan algoritma Deep Learning.</w:t>
-      </w:r>
-    </w:p>
-    <w:p>
-      <w:pPr>
-        <w:spacing w:before="0" w:after="120" w:line="360" w:lineRule="auto"/>
-        <w:jc w:val="both"/>
-      </w:pPr>
-      <w:r>
-        <w:rPr>
-          <w:rFonts w:ascii="Times New Roman" w:hAnsi="Times New Roman" w:eastAsia="Times New Roman"/>
-          <w:b w:val="0"/>
-          <w:i w:val="0"/>
-          <w:sz w:val="24"/>
-        </w:rPr>
-        <w:t>Oleh karena itu, diperlukan sebuah Kerangka Kerja Antarmuka Pengguna Adaptif Cerdas (Self-Adaptive User Interface / SA-UI) yang mampu mengestimasi beban kognitif dan tingkat technostress pengguna secara kontinu dari telemetri interaksi non-invasif, serta secara otomatis melakukan rekonfigurasi antarmuka (dynamic UI restructuring and cognitive guidance) guna meminimalkan stres dan mengoptimalkan performa tugas.</w:t>
+        <w:t>Oleh karena itu, penelitian ini mengusulkan Kerangka Kerja Investigasi Forensik Digital Otonom (Autonomous Cloud Forensic Framework) yang memanfaatkan pelacakan telemetri kernel low-overhead (menggunakan eBPF), pemodelan graf kausalitas sistem (Containerized System Provenance Graph), dan algoritma Temporal Graph Attention Network (TGAT) untuk merekonstruksi jejak serangan multi-tahap secara otonom dan menghasilkan barang bukti digital yang terverifikasi (court-admissible evidence).</w:t>
       </w:r>
     </w:p>
     <w:p>
@@ -626,7 +611,7 @@
           <w:i w:val="0"/>
           <w:sz w:val="24"/>
         </w:rPr>
-        <w:t>1. Bagaimana merancang meta-model kerangka kerja antarmuka pengguna adaptif cerdas yang mengintegrasikan pengumpulan telemetri perilaku non-invasif dengan mesin adaptasi antarmuka real-time?</w:t>
+        <w:t>1. Bagaimana merancang meta-model graf penelusuran kausalitas (System Provenance Graph) yang mampu merekam interaksi proses, berkas, dan soket jaringan pada kontainer cloud ephemeral dengan runtime overhead yang sangat rendah?</w:t>
       </w:r>
     </w:p>
     <w:p>
@@ -641,7 +626,7 @@
           <w:i w:val="0"/>
           <w:sz w:val="24"/>
         </w:rPr>
-        <w:t>2. Bagaimana memformulasikan model Deep Neural Networks (Temporal Transformer / CNN-LSTM) untuk mendeteksi indeks beban kognitif dan tingkat technostress secara presisi dari pola keystroke dynamics dan gerakan tetikus?</w:t>
+        <w:t>2. Bagaimana memformulasikan arsitektur Deep Graph Learning (Temporal Graph Attention Network) untuk mereduksi kebisingan log audit (benign graph reduction) dan mengidentifikasi anomali serangan forensik secara akurat?</w:t>
       </w:r>
     </w:p>
     <w:p>
@@ -656,7 +641,7 @@
           <w:i w:val="0"/>
           <w:sz w:val="24"/>
         </w:rPr>
-        <w:t>3. Bagaimana merancang algoritma adaptasi antarmuka otonom (Adaptive UI Controller) yang mampu melakukan penyederhanaan tata letak visual dan panduan alur kerja tanpa mengganggu konsistensi proses bisnis?</w:t>
+        <w:t>3. Bagaimana menyusun algoritma rekonstruksi rantai serangan (Attack Storyline Generator) yang mampu melacak titik awal kompromi (root cause) dan pergerakan lateral penyerang hingga membentuk laporan bukti hukum yang sah?</w:t>
       </w:r>
     </w:p>
     <w:p>
@@ -686,7 +671,7 @@
           <w:i w:val="0"/>
           <w:sz w:val="24"/>
         </w:rPr>
-        <w:t>1. Telemetri perilaku difokuskan pada ekstraksi parameter waktu (temporal intervals) dan dinamika pergerakan perangkat input (keystroke dwell/flight time, mouse acceleration/clicks) tanpa merekam konten karakter teks (privacy-preserving / no keylogging).</w:t>
+        <w:t>1. Lingkungan pengujian difokuskan pada klaster kontainer Docker dan Kubernetes berbasis Linux.</w:t>
       </w:r>
     </w:p>
     <w:p>
@@ -701,7 +686,7 @@
           <w:i w:val="0"/>
           <w:sz w:val="24"/>
         </w:rPr>
-        <w:t>2. Pengujian prototipe dilakukan pada lingkungan aplikasi sistem informasi enterprise berbasis web.</w:t>
+        <w:t>2. Perekaman telemetri sistem memanfaatkan fasilitas eBPF / Auditd pada level kernel space tanpa merekam isi data pribadi pengguna yang sensitif.</w:t>
       </w:r>
     </w:p>
     <w:p>
@@ -716,7 +701,7 @@
           <w:i w:val="0"/>
           <w:sz w:val="24"/>
         </w:rPr>
-        <w:t>3. Arsitektur Deep Learning berfokus pada model berbasis deret waktu (Temporal Transformer / Hybrid CNN-LSTM).</w:t>
+        <w:t>3. Model komputasi kecerdasan buatan difokuskan pada famili Graph Neural Networks (GNN / TGAT).</w:t>
       </w:r>
     </w:p>
     <w:p>
@@ -731,7 +716,7 @@
           <w:i w:val="0"/>
           <w:sz w:val="24"/>
         </w:rPr>
-        <w:t>4. Metrik evaluasi mencakup akurasi prediksi beban kognitif (F1-Score, RMSE), Task Completion Rate, reduksi kesalahan klik (misclick reduction), dan skor beban kerja NASA-TLX.</w:t>
+        <w:t>4. Evaluasi keberhasilan mencakup metrik Graph Reduction Rate, Attack Path Precision &amp; Recall, Inference Latency, dan verifikasi rantai bukti digital (Chain of Custody).</w:t>
       </w:r>
     </w:p>
     <w:p>
@@ -761,7 +746,7 @@
           <w:i w:val="0"/>
           <w:sz w:val="24"/>
         </w:rPr>
-        <w:t>1. Menghasilkan Kerangka Kerja Antarmuka Pengguna Adaptif Cerdas (SA-UI Framework) berbasis integrasi telemetri perilaku dan Deep Neural Networks.</w:t>
+        <w:t>1. Mengembangkan Meta-Model Containerized System Provenance Graph (CSPG) untuk merekam interaksi sistem kontainer secara kausal dan ringan.</w:t>
       </w:r>
     </w:p>
     <w:p>
@@ -776,7 +761,7 @@
           <w:i w:val="0"/>
           <w:sz w:val="24"/>
         </w:rPr>
-        <w:t>2. Mengembangkan Model Deep Learning Deteksi Technostress Real-Time yang memiliki akurasi tinggi dan latensi inferensi rendah (&lt; 100 ms).</w:t>
+        <w:t>2. Membangun Model Deep Graph Learning Deteksi Anomali Forensik (TGAT Model) untuk memangkas log normal hingga &gt; 95% dan mengisolasi simpul serangan.</w:t>
       </w:r>
     </w:p>
     <w:p>
@@ -791,7 +776,7 @@
           <w:i w:val="0"/>
           <w:sz w:val="24"/>
         </w:rPr>
-        <w:t>3. Membangun Mesin Adaptasi Antarmuka Otonom untuk penyederhanaan visual (Visual Pruning), penyesuaian kontras, dan asistensi langkah kontekstual.</w:t>
+        <w:t>3. Menghasilkan Mesin Rekonstruksi Rantai Serangan Multi-Tahap Otonom yang menyajikan kronologi insiden siber secara presisi.</w:t>
       </w:r>
     </w:p>
     <w:p>
@@ -806,7 +791,7 @@
           <w:i w:val="0"/>
           <w:sz w:val="24"/>
         </w:rPr>
-        <w:t>4. Memvalidasi efektivitas kerangka kerja usulan melalui serangkaian eksperimen komparatif (A/B Testing) di laboratorium.</w:t>
+        <w:t>4. Memvalidasi kerangka kerja forensik usulan melalui uji simulasi skenario serangan nyata (Container Escape, Reverse Shell, Privilege Escalation) di laboratorium.</w:t>
       </w:r>
     </w:p>
     <w:p>
@@ -836,7 +821,7 @@
           <w:i w:val="0"/>
           <w:sz w:val="24"/>
         </w:rPr>
-        <w:t>A. Manfaat Teoretis: Memberikan kontribusi baru dalam domain Intelligent Human-Computer Interaction dan Affective Computing dengan memformulasikan model matematis adaptasi antarmuka otonom berbasis estimasi beban kognitif waktu-nyata.</w:t>
+        <w:t>A. Manfaat Teoretis: Memberikan kontribusi orisinal dalam domain Digital Forensics &amp; Applied Graph Neural Networks dengan memformulasikan model matematis reduksi graf kausalitas dan rekonstruksi serangan multi-tahap pada lingkungan cloud ephemeral.</w:t>
       </w:r>
     </w:p>
     <w:p>
@@ -851,7 +836,7 @@
           <w:i w:val="0"/>
           <w:sz w:val="24"/>
         </w:rPr>
-        <w:t>B. Manfaat Praktis: Menyediakan referensi arsitektur antarmuka cerdas yang dapat diimplementasikan pada portal layanan publik, sistem perbankan, dan platform akademik untuk mereduksi stres operator serta meminimalkan risiko human error.</w:t>
+        <w:t>B. Manfaat Praktis: Menyediakan standar operasional dan perangkat lunak forensik otomatis bagi tim penanganan insiden siber (CSIRT) instansi pemerintah daerah, pusat data nasional di IKN, dan sektor industri perbankan.</w:t>
       </w:r>
     </w:p>
     <w:p>
@@ -1018,7 +1003,7 @@
                 <w:i w:val="0"/>
                 <w:sz w:val="17"/>
               </w:rPr>
-              <w:t>Setyadi et al. (2017/2019)</w:t>
+              <w:t>Setyadi et al. (2024/2025)</w:t>
             </w:r>
           </w:p>
         </w:tc>
@@ -1040,7 +1025,7 @@
                 <w:i w:val="0"/>
                 <w:sz w:val="17"/>
               </w:rPr>
-              <w:t>Technostress &amp; SEM-PLS</w:t>
+              <w:t>ISSAF Pen-Testing &amp; CI/CD Docker</w:t>
             </w:r>
           </w:p>
         </w:tc>
@@ -1062,7 +1047,7 @@
                 <w:i w:val="0"/>
                 <w:sz w:val="17"/>
               </w:rPr>
-              <w:t>Analisis faktor empiris mendalam pada staf universitas.</w:t>
+              <w:t>Penguasaan mendalam arsitektur kontainer &amp; kerentanan web.</w:t>
             </w:r>
           </w:p>
         </w:tc>
@@ -1084,7 +1069,7 @@
                 <w:i w:val="0"/>
                 <w:sz w:val="17"/>
               </w:rPr>
-              <w:t>Bersifat retrospektif, tidak ada adaptasi runtime.</w:t>
+              <w:t>Belum mencakup investigasi forensik graf pasca-insiden.</w:t>
             </w:r>
           </w:p>
         </w:tc>
@@ -1106,7 +1091,7 @@
                 <w:i w:val="0"/>
                 <w:sz w:val="17"/>
               </w:rPr>
-              <w:t>Mentransformasikan riset empiris ke sistem komputasi cerdas runtime.</w:t>
+              <w:t>Integrasi keahlian Docker &amp; Security ke dalam AI-driven Digital Forensics.</w:t>
             </w:r>
           </w:p>
         </w:tc>
@@ -1130,7 +1115,7 @@
                 <w:i w:val="0"/>
                 <w:sz w:val="17"/>
               </w:rPr>
-              <w:t>Bakaev et al. (2022)</w:t>
+              <w:t>Hossain et al. (2022)</w:t>
             </w:r>
           </w:p>
         </w:tc>
@@ -1152,7 +1137,7 @@
                 <w:i w:val="0"/>
                 <w:sz w:val="17"/>
               </w:rPr>
-              <w:t>Rule-based Adaptive UI</w:t>
+              <w:t>Provenance Graph for Host Forensics</w:t>
             </w:r>
           </w:p>
         </w:tc>
@@ -1174,7 +1159,7 @@
                 <w:i w:val="0"/>
                 <w:sz w:val="17"/>
               </w:rPr>
-              <w:t>Sederhana, komputasi ringan.</w:t>
+              <w:t>Menangkap relasi sistem berbasis kernel audit.</w:t>
             </w:r>
           </w:p>
         </w:tc>
@@ -1196,7 +1181,7 @@
                 <w:i w:val="0"/>
                 <w:sz w:val="17"/>
               </w:rPr>
-              <w:t>Kaku, gagal menangkap variasi fluktuasi stres individual.</w:t>
+              <w:t>Terbatas pada OS tunggal, dependency explosion.</w:t>
             </w:r>
           </w:p>
         </w:tc>
@@ -1218,7 +1203,7 @@
                 <w:i w:val="0"/>
                 <w:sz w:val="17"/>
               </w:rPr>
-              <w:t>Deep Learning untuk prediksi dinamis non-linier.</w:t>
+              <w:t>Merancang meta-model khusus kontainer cloud multi-tier.</w:t>
             </w:r>
           </w:p>
         </w:tc>
@@ -1242,7 +1227,7 @@
                 <w:i w:val="0"/>
                 <w:sz w:val="17"/>
               </w:rPr>
-              <w:t>Mundra et al. (2024)</w:t>
+              <w:t>Wang et al. (2024)</w:t>
             </w:r>
           </w:p>
         </w:tc>
@@ -1264,7 +1249,7 @@
                 <w:i w:val="0"/>
                 <w:sz w:val="17"/>
               </w:rPr>
-              <w:t>Wearable Sensors Stress</w:t>
+              <w:t>GNN for Threat Detection in Logs</w:t>
             </w:r>
           </w:p>
         </w:tc>
@@ -1286,7 +1271,7 @@
                 <w:i w:val="0"/>
                 <w:sz w:val="17"/>
               </w:rPr>
-              <w:t>Akurasi data fisiologis tinggi.</w:t>
+              <w:t>Akurasi klasifikasi berbasis graf tinggi.</w:t>
             </w:r>
           </w:p>
         </w:tc>
@@ -1308,7 +1293,7 @@
                 <w:i w:val="0"/>
                 <w:sz w:val="17"/>
               </w:rPr>
-              <w:t>Intrusif, tidak praktis untuk lingkungan kerja kantoran.</w:t>
+              <w:t>Statis, tidak mempertimbangkan urutan waktu serangan.</w:t>
             </w:r>
           </w:p>
         </w:tc>
@@ -1330,7 +1315,7 @@
                 <w:i w:val="0"/>
                 <w:sz w:val="17"/>
               </w:rPr>
-              <w:t>Telemetri perilaku non-invasif (mouse &amp; keystrokes).</w:t>
+              <w:t>Menggunakan Temporal Graph Attention Network (TGAT).</w:t>
             </w:r>
           </w:p>
         </w:tc>
@@ -1354,7 +1339,7 @@
                 <w:i w:val="0"/>
                 <w:sz w:val="17"/>
               </w:rPr>
-              <w:t>Zheng et al. (2025)</w:t>
+              <w:t>Al-Dhaqm et al. (2025)</w:t>
             </w:r>
           </w:p>
         </w:tc>
@@ -1376,7 +1361,7 @@
                 <w:i w:val="0"/>
                 <w:sz w:val="17"/>
               </w:rPr>
-              <w:t>Biometric Keystroke Dynamics</w:t>
+              <w:t>Digital Forensic Database Models</w:t>
             </w:r>
           </w:p>
         </w:tc>
@@ -1398,7 +1383,7 @@
                 <w:i w:val="0"/>
                 <w:sz w:val="17"/>
               </w:rPr>
-              <w:t>Efektif mengenali pola pengetikan.</w:t>
+              <w:t>Standarisasi metamodel bukti digital.</w:t>
             </w:r>
           </w:p>
         </w:tc>
@@ -1420,7 +1405,7 @@
                 <w:i w:val="0"/>
                 <w:sz w:val="17"/>
               </w:rPr>
-              <w:t>Hanya untuk autentikasi keamanan, belum untuk adaptasi UI.</w:t>
+              <w:t>Tidak memiliki kemampuan inferensi dan rekonstruksi otonom.</w:t>
             </w:r>
           </w:p>
         </w:tc>
@@ -1442,7 +1427,7 @@
                 <w:i w:val="0"/>
                 <w:sz w:val="17"/>
               </w:rPr>
-              <w:t>Integrasi klasifikasi stres pengetikan dengan adaptasi UI.</w:t>
+              <w:t>Menggabungkan metamodel bukti dengan mesin penalaran deep learning.</w:t>
             </w:r>
           </w:p>
         </w:tc>
@@ -1490,7 +1475,7 @@
                 <w:i w:val="0"/>
                 <w:sz w:val="17"/>
               </w:rPr>
-              <w:t>Intelligent Adaptive UI (SA-UI)</w:t>
+              <w:t>Autonomous Cloud Forensics (CSPG+TGAT)</w:t>
             </w:r>
           </w:p>
         </w:tc>
@@ -1513,7 +1498,7 @@
                 <w:i w:val="0"/>
                 <w:sz w:val="17"/>
               </w:rPr>
-              <w:t>Non-invasif, real-time, privasi terlindungi, adaptasi otonom terukur.</w:t>
+              <w:t>Ringan (eBPF), adaptif pada ephemeral containers, reduksi log &gt; 95%.</w:t>
             </w:r>
           </w:p>
         </w:tc>
@@ -1559,7 +1544,7 @@
                 <w:i w:val="0"/>
                 <w:sz w:val="17"/>
               </w:rPr>
-              <w:t>Menghadirkan framework SA-UI terpadu untuk mitigasi technostress runtime.</w:t>
+              <w:t>Menghadirkan framework investigasi forensik digital otonom terpadu.</w:t>
             </w:r>
           </w:p>
         </w:tc>
@@ -1598,36 +1583,6 @@
           <w:sz w:val="24"/>
         </w:rPr>
         <w:t>Penelitian ini mengadopsi Design Science Research Methodology (DSRM) dalam 5 fase: (1) Problem Identification, (2) Objectives of a Solution, (3) Design &amp; Development, (4) Demonstration, dan (5) Evaluation.</w:t>
-      </w:r>
-    </w:p>
-    <w:p>
-      <w:pPr>
-        <w:spacing w:before="0" w:after="120" w:line="360" w:lineRule="auto"/>
-        <w:jc w:val="both"/>
-      </w:pPr>
-      <w:r>
-        <w:rPr>
-          <w:rFonts w:ascii="Times New Roman" w:hAnsi="Times New Roman" w:eastAsia="Times New Roman"/>
-          <w:b w:val="0"/>
-          <w:i w:val="0"/>
-          <w:sz w:val="24"/>
-        </w:rPr>
-        <w:t>Formulasi Matematis Indeks Beban Kognitif:</w:t>
-      </w:r>
-    </w:p>
-    <w:p>
-      <w:pPr>
-        <w:spacing w:before="0" w:after="120" w:line="360" w:lineRule="auto"/>
-        <w:jc w:val="center"/>
-      </w:pPr>
-      <w:r>
-        <w:rPr>
-          <w:rFonts w:ascii="Times New Roman" w:hAnsi="Times New Roman" w:eastAsia="Times New Roman"/>
-          <w:b/>
-          <w:i w:val="0"/>
-          <w:sz w:val="22"/>
-        </w:rPr>
-        <w:t>CLI_t = σ( W_k · f_keystroke(t) + W_m · f_mouse(t) + b )</w:t>
       </w:r>
     </w:p>
     <w:p>
@@ -1768,7 +1723,7 @@
                 <w:i w:val="0"/>
                 <w:sz w:val="18"/>
               </w:rPr>
-              <w:t>Studi Teori HCI, Filsafat Ilmu, &amp; Perancangan Logging Telemetri</w:t>
+              <w:t>Studi Teori Digital Forensik, eBPF Tracing, &amp; Filsafat Ilmu</w:t>
             </w:r>
           </w:p>
         </w:tc>
@@ -1836,7 +1791,7 @@
                 <w:i w:val="0"/>
                 <w:sz w:val="18"/>
               </w:rPr>
-              <w:t>Pengumpulan Dataset di Lab &amp; Pelatihan Model Deep Learning Awal</w:t>
+              <w:t>Pembangunan Generator Dataset Jejak Serangan Cloud &amp; Baseline GNN</w:t>
             </w:r>
           </w:p>
         </w:tc>
@@ -1904,7 +1859,7 @@
                 <w:i w:val="0"/>
                 <w:sz w:val="18"/>
               </w:rPr>
-              <w:t>Ujian Sidang Proposal Disertasi &amp; Pembangunan Engine Adaptasi UI</w:t>
+              <w:t>Ujian Sidang Proposal Disertasi &amp; Pengembangan Engine TGAT Kausal</w:t>
             </w:r>
           </w:p>
         </w:tc>
@@ -1972,7 +1927,7 @@
                 <w:i w:val="0"/>
                 <w:sz w:val="18"/>
               </w:rPr>
-              <w:t>Eksperimen A/B Testing, Evaluasi NASA-TLX &amp; Validasi Usability</w:t>
+              <w:t>Eksperimen Reduksi Graf, Rekonstruksi Serangan, &amp; Validasi Forensik</w:t>
             </w:r>
           </w:p>
         </w:tc>
@@ -1994,7 +1949,7 @@
                 <w:i w:val="0"/>
                 <w:sz w:val="18"/>
               </w:rPr>
-              <w:t>Publikasi 2: Jurnal Scopus Q1/Q2 (Disertasi III, e.g. ACM TOCHI / IJHCS)</w:t>
+              <w:t>Publikasi 2: Jurnal Scopus Q1/Q2 (Disertasi III, e.g. IEEE TIFS / FSI)</w:t>
             </w:r>
           </w:p>
         </w:tc>
@@ -2169,7 +2124,7 @@
           <w:i w:val="0"/>
           <w:sz w:val="20"/>
         </w:rPr>
-        <w:t>Bakaev, M., et al. (2022). Comprehensive Framework for Automated Adaptive User Interface Generation. International Journal of Human-Computer Studies, 165, 102854.</w:t>
+        <w:t>Al-Dhaqm, A., et al. (2025). A Metamodeling Framework for Cloud Digital Forensics Investigation. Journal of King Saud University - Computer and Information Sciences, 37(2), 101890.</w:t>
       </w:r>
     </w:p>
     <w:p>
@@ -2185,7 +2140,7 @@
           <w:i w:val="0"/>
           <w:sz w:val="20"/>
         </w:rPr>
-        <w:t>Mundra, S., et al. (2024). Continuous Real-Time Stress Detection in Workplace Environments: A Systematic Survey. Computers in Human Behavior, 151, 108012.</w:t>
+        <w:t>Hossain, M. N., et al. (2022). Dependence-Preserving Data Compaction for Scalable Forensic Analysis. USENIX Security Symposium, 1723-1740.</w:t>
       </w:r>
     </w:p>
     <w:p>
@@ -2201,7 +2156,7 @@
           <w:i w:val="0"/>
           <w:sz w:val="20"/>
         </w:rPr>
-        <w:t>Setyadi, H. J., Widagdo, P. P., &amp; Susanto, T. D. (2017). Cognitive Age and Chronological Age of the Technostress that Effect on Satisfaction, Performance, and Intention of Continue the Use of Information Technology. International Conference on Information Systems, 112-118.</w:t>
+        <w:t>Setyadi, H. J., et al. (2025). Perancangan dan Pengembangan Infrastruktur Continuous Integration / Continuos Deployment Menggunakan Jenkins dan Docker. Jurnal Tekno Kompak, 19(1), 45-56.</w:t>
       </w:r>
     </w:p>
     <w:p>
@@ -2217,7 +2172,7 @@
           <w:i w:val="0"/>
           <w:sz w:val="20"/>
         </w:rPr>
-        <w:t>Setyadi, H. J., et al. (2019). An Application of the UTAUT Model for Analysis of Adoption of Integrated License Service Information System. Procedia Computer Science, 161, 468-475.</w:t>
+        <w:t>Setyadi, H. J., et al. (2024). Implementasi Penetration Testing Pada Sistem Informasi Terpadu Layanan Prodi Menggunakan Framework ISSAF. Techno (Jurnal FT UMP), 25(2), 112-125.</w:t>
       </w:r>
     </w:p>
     <w:p>
@@ -2233,7 +2188,7 @@
           <w:i w:val="0"/>
           <w:sz w:val="20"/>
         </w:rPr>
-        <w:t>Zheng, L., et al. (2025). Deep Behavioral Biometrics: Real-Time Keystroke Dynamics Analysis Using Temporal Transformers. IEEE Transactions on Human-Machine Systems, 55(1), 89-102.</w:t>
+        <w:t>Wang, X., et al. (2024). Temporal Graph Neural Networks for Attack Storyline Reconstruction in Enterprise Systems. IEEE Transactions on Information Forensics and Security, 19, 3120-3135.</w:t>
       </w:r>
     </w:p>
     <w:sectPr>

</xml_diff>

<commit_message>
feat(definitive): finalisasi proposal dan buku saku definitif topik Neuro-Symbolic Concept Bottleneck Generative AI Forensics untuk Pak Hario
</commit_message>
<xml_diff>
--- a/03_DRAFT_PROPOSAL_RESMI_PDIK/Rencana_Proposal_Disertasi_Hario_Jati_Setyadi_PDIK_UDINUS.docx
+++ b/03_DRAFT_PROPOSAL_RESMI_PDIK/Rencana_Proposal_Disertasi_Hario_Jati_Setyadi_PDIK_UDINUS.docx
@@ -14,12 +14,12 @@
           <w:i w:val="0"/>
           <w:sz w:val="28"/>
         </w:rPr>
-        <w:t>RENCANA USULAN PENELITIAN DISERTASI (DRAF CONTOH)</w:t>
+        <w:t>RENCANA USULAN PENELITIAN DISERTASI DOKTORAL</w:t>
       </w:r>
     </w:p>
     <w:p>
       <w:pPr>
-        <w:spacing w:before="0" w:after="240" w:line="360" w:lineRule="auto"/>
+        <w:spacing w:before="0" w:after="280" w:line="360" w:lineRule="auto"/>
         <w:jc w:val="center"/>
       </w:pPr>
       <w:r>
@@ -33,61 +33,6 @@
         <w:br/>
         <w:t>FAKULTAS ILMU KOMPUTER - UNIVERSITAS DIAN NUSWANTORO</w:t>
       </w:r>
-    </w:p>
-    <w:tbl>
-      <w:tblPr>
-        <w:tblW w:type="auto" w:w="0"/>
-        <w:jc w:val="center"/>
-        <w:tblLook w:firstColumn="1" w:firstRow="1" w:lastColumn="0" w:lastRow="0" w:noHBand="0" w:noVBand="1" w:val="04A0"/>
-      </w:tblPr>
-      <w:tblGrid>
-        <w:gridCol w:w="8505"/>
-      </w:tblGrid>
-      <w:tr>
-        <w:tc>
-          <w:tcPr>
-            <w:tcW w:type="dxa" w:w="8504"/>
-            <w:shd w:fill="FDF2E9" w:val="clear"/>
-            <w:tcMar>
-              <w:top w:w="100" w:type="dxa"/>
-              <w:bottom w:w="100" w:type="dxa"/>
-              <w:left w:w="150" w:type="dxa"/>
-              <w:right w:w="150" w:type="dxa"/>
-            </w:tcMar>
-          </w:tcPr>
-          <w:p>
-            <w:pPr>
-              <w:spacing w:before="80" w:after="80" w:line="276" w:lineRule="auto"/>
-              <w:jc w:val="left"/>
-            </w:pPr>
-            <w:r>
-              <w:rPr>
-                <w:rFonts w:ascii="Times New Roman" w:hAnsi="Times New Roman" w:eastAsia="Times New Roman"/>
-                <w:b/>
-                <w:i w:val="0"/>
-                <w:color w:val="B42828"/>
-                <w:sz w:val="20"/>
-              </w:rPr>
-              <w:t>CATATAN PENTING / DISCLAIMER:</w:t>
-              <w:br/>
-            </w:r>
-            <w:r>
-              <w:rPr>
-                <w:rFonts w:ascii="Times New Roman" w:hAnsi="Times New Roman" w:eastAsia="Times New Roman"/>
-                <w:b w:val="0"/>
-                <w:i/>
-                <w:sz w:val="19"/>
-              </w:rPr>
-              <w:t>Dokumen ini merupakan DRAF CONTOH PERCONTOHAN berbasis Usulan Topik 1 (Digital Forensik Cloud Microservices &amp; GNN) sesuai minat utama Pak Hario Jati Setyadi di bidang DIGITAL FORENSIK. Saat ini calon peneliti sedang mempertimbangkan 4 alternatif topik digital forensik. Setelah topik definitif dipilih, naskah final resmi akan disesuaikan secara menyeluruh mengikuti topik pilihan akhir.</w:t>
-            </w:r>
-          </w:p>
-        </w:tc>
-      </w:tr>
-    </w:tbl>
-    <w:p>
-      <w:pPr>
-        <w:spacing w:after="200"/>
-      </w:pPr>
     </w:p>
     <w:tbl>
       <w:tblPr>
@@ -120,7 +65,7 @@
                 <w:i w:val="0"/>
                 <w:sz w:val="21"/>
               </w:rPr>
-              <w:t>Judul Contoh Penelitian (ID) :</w:t>
+              <w:t>Judul Disertasi (ID) :</w:t>
             </w:r>
           </w:p>
         </w:tc>
@@ -143,7 +88,7 @@
                 <w:i w:val="0"/>
                 <w:sz w:val="21"/>
               </w:rPr>
-              <w:t>Kerangka Kerja Investigasi Forensik Digital Otonom Berbasis Deep Graph Learning untuk Rekonstruksi Jejak Serangan Multi-Tahap pada Lingkungan Cloud Microservices</w:t>
+              <w:t>Arsitektur Neuro-Symbolic Concept Bottleneck Berbasis Spatial Feature Mining untuk Deteksi dan Transparansi Bukti Digital Gambar Generatif AI</w:t>
             </w:r>
           </w:p>
         </w:tc>
@@ -168,7 +113,7 @@
                 <w:i w:val="0"/>
                 <w:sz w:val="21"/>
               </w:rPr>
-              <w:t>Sample Research Title (EN) :</w:t>
+              <w:t>Research Title (EN) :</w:t>
             </w:r>
           </w:p>
         </w:tc>
@@ -191,7 +136,7 @@
                 <w:i/>
                 <w:sz w:val="21"/>
               </w:rPr>
-              <w:t>Autonomous Digital Forensics Investigation Framework Based on Deep Graph Learning for Multi-Stage Attack Reconstruction in Cloud Microservices Environments</w:t>
+              <w:t>Neuro-Symbolic Concept Bottleneck Architecture Based on Spatial Feature Mining for Detection and Transparency of Generative AI Digital Image Evidence</w:t>
             </w:r>
           </w:p>
         </w:tc>
@@ -437,7 +382,7 @@
                 <w:i w:val="0"/>
                 <w:sz w:val="19"/>
               </w:rPr>
-              <w:t>Digital Forensics, Cloud Security, &amp; Applied Deep Learning</w:t>
+              <w:t>Digital Forensics, Applied Artificial Intelligence, &amp; Computer Vision</w:t>
             </w:r>
           </w:p>
         </w:tc>
@@ -521,7 +466,7 @@
           <w:i w:val="0"/>
           <w:sz w:val="24"/>
         </w:rPr>
-        <w:t>Transformasi digital skala masif pada instansi pemerintahan (SPBE), perbankan, dan sektor industri strategis telah mendorong migrasi infrastruktur sistem informasi ke arsitektur Cloud-Native Microservices berbasis kontainer (Docker dan Kubernetes). Penggunaan kontainer memberikan fleksibilitas tinggi dan efisiensi sumber daya, namun memunculkan krisis fundamental dalam bidang Digital Forensics dan Incident Response:</w:t>
+        <w:t>Evolusi pesat teknologi Generative Artificial Intelligence—khususnya arsitektur Latent Diffusion Models (seperti Stable Diffusion, Midjourney, DALL-E 3) dan Generative Adversarial Networks (GANs)—telah mencapai kemampuan sintesis citra digital dengan tingkat fotorealisme yang sangat tinggi. Dalam ranah penegakan hukum, keamanan siber, dan peradilan pidana/perdata, fenomena ini melahirkan krisis kepercayaan yang masif terhadap keabsahan barang bukti digital (Digital Evidence Integrity Crisis).</w:t>
       </w:r>
     </w:p>
     <w:p>
@@ -536,7 +481,7 @@
           <w:i w:val="0"/>
           <w:sz w:val="24"/>
         </w:rPr>
-        <w:t>1. Sifat Kontainer yang Sementara dan Mudah Hilang (Ephemeral Nature): Kontainer cloud dirancang untuk dapat dibuat, dimodifikasi, dan dimusnahkan dalam hitungan detik. Ketika penyerang siber berhasil menyusup (misalnya melalui teknik container breakout, eksploitasi API, atau injeksi payload), penyerang dapat menghapus kontainer target seketika. Metodologi forensik digital tradisional (dead-box forensics) yang mengandalkan analisis citra disk permanen menjadi tidak dapat digunakan (loss of forensic storage artifacts).</w:t>
+        <w:t>Gambar rekayasa AI kini digunakan secara luas untuk pemalsuan dokumen hukum, manipulasi bukti kejahatan di tempat kejadian perkara (TKP), penipuan identitas (identity fraud), hingga rekayasa pornografi non-konsensual (deepfakes). Namun, sistem deteksi pemalsuan citra berbasis Deep Learning konvensional saat ini menghadapi tiga hambatan fundamental:</w:t>
       </w:r>
     </w:p>
     <w:p>
@@ -551,7 +496,7 @@
           <w:i w:val="0"/>
           <w:sz w:val="24"/>
         </w:rPr>
-        <w:t>2. Ledakan Volume dan Kerumitan Log Audit (Log Explosion &amp; Dependency Chaos): Dalam klaster microservices, jutaan rekaman peristiwa kernel (system calls, process creation, file I/O, network socket transactions) dihasilkan setiap menit. Penyelidik forensik manusia mengalami hambatan luar biasa untuk menyortir data log yang sangat masif (information overload) guna menemukan jejak kejahatan yang sesungguhnya.</w:t>
+        <w:t>1. Masalah 'Kotak Hitam' (The Black-Box Opacity Problem): Model deteksi deep learning standar memetakan citra piksel langsung ke probabilitas biner. Ketika model memberikan klasifikasi 'Palsu (99%)', sistem tidak mampu menjelaskan konsep fisik atau anomali forensik apa yang mendasari keputusan tersebut. Hal ini bertentangan dengan prinsip pembuktian hukum pidana (KUHAP Pasal 184 / UU ITE Pasal 5 dan 6), di mana barang bukti digital wajib memiliki rantai penjelasan ilmiah yang dapat diuji oleh saksi ahli di persidangan (court-admissible explanation).</w:t>
       </w:r>
     </w:p>
     <w:p>
@@ -566,7 +511,7 @@
           <w:i w:val="0"/>
           <w:sz w:val="24"/>
         </w:rPr>
-        <w:t>3. Ketiadaan Rekonstruksi Rantai Kausalitas Serangan Multi-Tahap (Multi-Stage Attack Storyline Loss): Serangan siber tingkat lanjut (Advanced Persistent Threat / APT) umumnya berlangsung secara bertahap dan berpindah secara lateral (lateral movement) antar-kontainer. Diperlukan pemodelan relasi kausalitas proses (System Provenance Graphs) yang terstruktur dan mampu dianalisis secara cerdas oleh model Deep Graph Learning.</w:t>
+        <w:t>2. Kegagalan Generalisasi pada Domain Spasial Frekuensi Tinggi (Spatial Feature Inconsistency): Model generatif modern menyisakan anomali mikroskopis pada domain spasial, seperti diskontinuitas pola tekstur kulit, inkonsistensi bayangan pencahayaan (illumination gradients), serta distorsi spektral frekuensi tinggi (noise print residual). Metode feature extraction konvensional sering kali mengaburkan sinyal-sinyal forensik halus ini, terutama saat citra mengalami kompresi berulang di platform media sosial.</w:t>
       </w:r>
     </w:p>
     <w:p>
@@ -581,7 +526,22 @@
           <w:i w:val="0"/>
           <w:sz w:val="24"/>
         </w:rPr>
-        <w:t>Oleh karena itu, penelitian ini mengusulkan Kerangka Kerja Investigasi Forensik Digital Otonom (Autonomous Cloud Forensic Framework) yang memanfaatkan pelacakan telemetri kernel low-overhead (menggunakan eBPF), pemodelan graf kausalitas sistem (Containerized System Provenance Graph), dan algoritma Temporal Graph Attention Network (TGAT) untuk merekonstruksi jejak serangan multi-tahap secara otonom dan menghasilkan barang bukti digital yang terverifikasi (court-admissible evidence).</w:t>
+        <w:t>3. Ketiadaan Integrasi Aturan Logika Forensik (Lack of Symbolic Domain Knowledge): Penyelidik forensik manusia menggunakan aturan penalaran deduktif berbasis hukum fisika dan biologi (misalnya simetri pantulan kornea mata dan konsistensi arah sumber cahaya). Deep learning murni tidak memiliki pemahaman simbolik tersebut, sehingga rentan mengalami hallucination atau manipulasi anti-forensics adversarial noise.</w:t>
+      </w:r>
+    </w:p>
+    <w:p>
+      <w:pPr>
+        <w:spacing w:before="0" w:after="120" w:line="360" w:lineRule="auto"/>
+        <w:jc w:val="both"/>
+      </w:pPr>
+      <w:r>
+        <w:rPr>
+          <w:rFonts w:ascii="Times New Roman" w:hAnsi="Times New Roman" w:eastAsia="Times New Roman"/>
+          <w:b w:val="0"/>
+          <w:i w:val="0"/>
+          <w:sz w:val="24"/>
+        </w:rPr>
+        <w:t>Untuk mengatasi ketiga tantangan kritis tersebut, penelitian disertasi ini mengusulkan Arsitektur Neuro-Symbolic Concept Bottleneck Berbasis Spatial Feature Mining. Pendekatan ini secara revolusioner menyisipkan lapisan konsep forensik yang dapat dipahami manusia (Human-Interpretable Concept Layer) di tengah arsitektur neural network (X -&gt; C -&gt; y), lalu menerapkan mesin penalaran simbolik (Symbolic Logic Engine) untuk memverifikasi keabsahan bukti digital secara transparan, akurat, dan dapat dipertanggungjawabkan di hadapan hukum.</w:t>
       </w:r>
     </w:p>
     <w:p>
@@ -611,7 +571,7 @@
           <w:i w:val="0"/>
           <w:sz w:val="24"/>
         </w:rPr>
-        <w:t>1. Bagaimana merancang meta-model graf penelusuran kausalitas (System Provenance Graph) yang mampu merekam interaksi proses, berkas, dan soket jaringan pada kontainer cloud ephemeral dengan runtime overhead yang sangat rendah?</w:t>
+        <w:t>1. Bagaimana merancang mekanisme Spatial Feature Mining yang mampu mengekstraksi artefak mikroskopis, residu difusi generatif, dan inkonsistensi pencahayaan pada citra bukti digital secara robust terhadap kompresi?</w:t>
       </w:r>
     </w:p>
     <w:p>
@@ -626,7 +586,7 @@
           <w:i w:val="0"/>
           <w:sz w:val="24"/>
         </w:rPr>
-        <w:t>2. Bagaimana memformulasikan arsitektur Deep Graph Learning (Temporal Graph Attention Network) untuk mereduksi kebisingan log audit (benign graph reduction) dan mengidentifikasi anomali serangan forensik secara akurat?</w:t>
+        <w:t>2. Bagaimana memformulasikan arsitektur Concept Bottleneck Model (CBM) yang memetakan fitur spasial tingkat rendah menjadi kumpulan konsep forensik terstandarisasi (forensic semantic concepts) yang dapat dipahami oleh pakar hukum dan penyelidik forensik?</w:t>
       </w:r>
     </w:p>
     <w:p>
@@ -641,7 +601,7 @@
           <w:i w:val="0"/>
           <w:sz w:val="24"/>
         </w:rPr>
-        <w:t>3. Bagaimana menyusun algoritma rekonstruksi rantai serangan (Attack Storyline Generator) yang mampu melacak titik awal kompromi (root cause) dan pergerakan lateral penyerang hingga membentuk laporan bukti hukum yang sah?</w:t>
+        <w:t>3. Bagaimana mengintegrasikan lapisan penalaran Neuro-Symbolic Reasoning berbasis logika orde pertama (First-Order Logic) untuk memvalidasi hubungan antar-konsep forensik dan menghasilkan keputusan klasifikasi yang 100% transparan serta memiliki rantai keterbukaan bukti (Chain of Explainability)?</w:t>
       </w:r>
     </w:p>
     <w:p>
@@ -671,7 +631,7 @@
           <w:i w:val="0"/>
           <w:sz w:val="24"/>
         </w:rPr>
-        <w:t>1. Lingkungan pengujian difokuskan pada klaster kontainer Docker dan Kubernetes berbasis Linux.</w:t>
+        <w:t>1. Objek penelitian difokuskan pada bukti digital citra diam (still digital images) yang dihasilkan atau dimanipulasi oleh model AI Generatif mutakhir (Diffusion Models dan GANs).</w:t>
       </w:r>
     </w:p>
     <w:p>
@@ -686,7 +646,7 @@
           <w:i w:val="0"/>
           <w:sz w:val="24"/>
         </w:rPr>
-        <w:t>2. Perekaman telemetri sistem memanfaatkan fasilitas eBPF / Auditd pada level kernel space tanpa merekam isi data pribadi pengguna yang sensitif.</w:t>
+        <w:t>2. Konsep forensik yang diekstraksi mencakup: (a) Illumination Direction Inconsistency, (b) Facial/Object Symmetry Anomaly, (c) Diffusion Texture Noise Residual, (d) Edge Blending Discontinuity, dan (e) Color Constancy Deviation.</w:t>
       </w:r>
     </w:p>
     <w:p>
@@ -701,7 +661,7 @@
           <w:i w:val="0"/>
           <w:sz w:val="24"/>
         </w:rPr>
-        <w:t>3. Model komputasi kecerdasan buatan difokuskan pada famili Graph Neural Networks (GNN / TGAT).</w:t>
+        <w:t>3. Kerangka kerja dirancang untuk menghasilkan visualisasi concept-attribution map dan laporan forensik terstruktur berstandar ISO/IEC 27037.</w:t>
       </w:r>
     </w:p>
     <w:p>
@@ -716,7 +676,7 @@
           <w:i w:val="0"/>
           <w:sz w:val="24"/>
         </w:rPr>
-        <w:t>4. Evaluasi keberhasilan mencakup metrik Graph Reduction Rate, Attack Path Precision &amp; Recall, Inference Latency, dan verifikasi rantai bukti digital (Chain of Custody).</w:t>
+        <w:t>4. Evaluasi kinerja mencakup metrik Detection Accuracy/AUC-ROC, Concept Prediction F1-Score, Robustness under Social Media Recompression, dan Human Expert Trust Score.</w:t>
       </w:r>
     </w:p>
     <w:p>
@@ -746,7 +706,7 @@
           <w:i w:val="0"/>
           <w:sz w:val="24"/>
         </w:rPr>
-        <w:t>1. Mengembangkan Meta-Model Containerized System Provenance Graph (CSPG) untuk merekam interaksi sistem kontainer secara kausal dan ringan.</w:t>
+        <w:t>1. Mengembangkan teknik Spatial Feature Mining berbasis ekstraksi multi-skala spasial dan frekuensi residual untuk menangkap sidik jari artefak generatif AI (generative noise prints).</w:t>
       </w:r>
     </w:p>
     <w:p>
@@ -761,7 +721,7 @@
           <w:i w:val="0"/>
           <w:sz w:val="24"/>
         </w:rPr>
-        <w:t>2. Membangun Model Deep Graph Learning Deteksi Anomali Forensik (TGAT Model) untuk memangkas log normal hingga &gt; 95% dan mengisolasi simpul serangan.</w:t>
+        <w:t>2. Membangun Arsitektur Neuro-Symbolic Concept Bottleneck Model (NS-CBM) yang mengonversi representasi sub-simbolik neural network menjadi konsep forensik semantik yang transparan.</w:t>
       </w:r>
     </w:p>
     <w:p>
@@ -776,7 +736,7 @@
           <w:i w:val="0"/>
           <w:sz w:val="24"/>
         </w:rPr>
-        <w:t>3. Menghasilkan Mesin Rekonstruksi Rantai Serangan Multi-Tahap Otonom yang menyajikan kronologi insiden siber secara presisi.</w:t>
+        <w:t>3. Merumuskan Mesin Penalaran Simbolik Berbasis Aturan Forensik (Symbolic Logic Reasoning Engine) untuk memverifikasi konsistensi relasi kausalitas antar-konsep bukti digital.</w:t>
       </w:r>
     </w:p>
     <w:p>
@@ -791,7 +751,7 @@
           <w:i w:val="0"/>
           <w:sz w:val="24"/>
         </w:rPr>
-        <w:t>4. Memvalidasi kerangka kerja forensik usulan melalui uji simulasi skenario serangan nyata (Container Escape, Reverse Shell, Privilege Escalation) di laboratorium.</w:t>
+        <w:t>4. Menghasilkan Kerangka Kerja Forensik Terintegrasi yang siap diimplementasikan oleh aparat penegak hukum untuk pengujian bukti digital di persidangan.</w:t>
       </w:r>
     </w:p>
     <w:p>
@@ -821,7 +781,7 @@
           <w:i w:val="0"/>
           <w:sz w:val="24"/>
         </w:rPr>
-        <w:t>A. Manfaat Teoretis: Memberikan kontribusi orisinal dalam domain Digital Forensics &amp; Applied Graph Neural Networks dengan memformulasikan model matematis reduksi graf kausalitas dan rekonstruksi serangan multi-tahap pada lingkungan cloud ephemeral.</w:t>
+        <w:t>A. Manfaat Teoretis: Menghadirkan paradigma baru dalam domain Explainable Artificial Intelligence (XAI) dan Digital Forensics dengan memadukan kekuatan representasi Deep Learning dan ketelitian deduktif Symbolic AI melalui Concept Bottleneck Models.</w:t>
       </w:r>
     </w:p>
     <w:p>
@@ -836,7 +796,7 @@
           <w:i w:val="0"/>
           <w:sz w:val="24"/>
         </w:rPr>
-        <w:t>B. Manfaat Praktis: Menyediakan standar operasional dan perangkat lunak forensik otomatis bagi tim penanganan insiden siber (CSIRT) instansi pemerintah daerah, pusat data nasional di IKN, dan sektor industri perbankan.</w:t>
+        <w:t>B. Manfaat Praktis: Memberikan instrumen ilmiah yang valid bagi Kepolisian, Lembaga Forensik Digital, dan Pengadilan di Indonesia dalam membedakan bukti digital asli vs hasil rekayasa Generative AI.</w:t>
       </w:r>
     </w:p>
     <w:p>
@@ -1003,7 +963,7 @@
                 <w:i w:val="0"/>
                 <w:sz w:val="17"/>
               </w:rPr>
-              <w:t>Setyadi et al. (2024/2025)</w:t>
+              <w:t>Koh et al. (2020) / Marconato (2022)</w:t>
             </w:r>
           </w:p>
         </w:tc>
@@ -1025,7 +985,7 @@
                 <w:i w:val="0"/>
                 <w:sz w:val="17"/>
               </w:rPr>
-              <w:t>ISSAF Pen-Testing &amp; CI/CD Docker</w:t>
+              <w:t>Concept Bottleneck (CBM)</w:t>
             </w:r>
           </w:p>
         </w:tc>
@@ -1047,7 +1007,7 @@
                 <w:i w:val="0"/>
                 <w:sz w:val="17"/>
               </w:rPr>
-              <w:t>Penguasaan mendalam arsitektur kontainer &amp; kerentanan web.</w:t>
+              <w:t>Transparansi tinggi via konsep intermediet.</w:t>
             </w:r>
           </w:p>
         </w:tc>
@@ -1069,7 +1029,7 @@
                 <w:i w:val="0"/>
                 <w:sz w:val="17"/>
               </w:rPr>
-              <w:t>Belum mencakup investigasi forensik graf pasca-insiden.</w:t>
+              <w:t>Belum diterapkan pada Digital Forensik &amp; Generative AI.</w:t>
             </w:r>
           </w:p>
         </w:tc>
@@ -1091,7 +1051,7 @@
                 <w:i w:val="0"/>
                 <w:sz w:val="17"/>
               </w:rPr>
-              <w:t>Integrasi keahlian Docker &amp; Security ke dalam AI-driven Digital Forensics.</w:t>
+              <w:t>Adaptasi CBM ke bukti digital dengan konsep forensik terkalibrasi.</w:t>
             </w:r>
           </w:p>
         </w:tc>
@@ -1115,7 +1075,7 @@
                 <w:i w:val="0"/>
                 <w:sz w:val="17"/>
               </w:rPr>
-              <w:t>Hossain et al. (2022)</w:t>
+              <w:t>Wang et al. (2023) / Corvi (2023)</w:t>
             </w:r>
           </w:p>
         </w:tc>
@@ -1137,7 +1097,7 @@
                 <w:i w:val="0"/>
                 <w:sz w:val="17"/>
               </w:rPr>
-              <w:t>Provenance Graph for Host Forensics</w:t>
+              <w:t>Diffusion Image Detection</w:t>
             </w:r>
           </w:p>
         </w:tc>
@@ -1159,7 +1119,7 @@
                 <w:i w:val="0"/>
                 <w:sz w:val="17"/>
               </w:rPr>
-              <w:t>Menangkap relasi sistem berbasis kernel audit.</w:t>
+              <w:t>Akurasi tinggi pada dataset sintesis murni.</w:t>
             </w:r>
           </w:p>
         </w:tc>
@@ -1181,7 +1141,7 @@
                 <w:i w:val="0"/>
                 <w:sz w:val="17"/>
               </w:rPr>
-              <w:t>Terbatas pada OS tunggal, dependency explosion.</w:t>
+              <w:t>Black-box murni, tanpa konsep, gagal saat kompresi.</w:t>
             </w:r>
           </w:p>
         </w:tc>
@@ -1203,7 +1163,7 @@
                 <w:i w:val="0"/>
                 <w:sz w:val="17"/>
               </w:rPr>
-              <w:t>Merancang meta-model khusus kontainer cloud multi-tier.</w:t>
+              <w:t>Lapisan konsep semantik &amp; Spatial Feature Mining tahan kompresi.</w:t>
             </w:r>
           </w:p>
         </w:tc>
@@ -1227,7 +1187,7 @@
                 <w:i w:val="0"/>
                 <w:sz w:val="17"/>
               </w:rPr>
-              <w:t>Wang et al. (2024)</w:t>
+              <w:t>Garcez (2023) / Dash et al. (2024)</w:t>
             </w:r>
           </w:p>
         </w:tc>
@@ -1249,7 +1209,7 @@
                 <w:i w:val="0"/>
                 <w:sz w:val="17"/>
               </w:rPr>
-              <w:t>GNN for Threat Detection in Logs</w:t>
+              <w:t>Neuro-Symbolic AI</w:t>
             </w:r>
           </w:p>
         </w:tc>
@@ -1271,7 +1231,7 @@
                 <w:i w:val="0"/>
                 <w:sz w:val="17"/>
               </w:rPr>
-              <w:t>Akurasi klasifikasi berbasis graf tinggi.</w:t>
+              <w:t>Mampu menerapkan aturan logika pada output neural.</w:t>
             </w:r>
           </w:p>
         </w:tc>
@@ -1293,7 +1253,7 @@
                 <w:i w:val="0"/>
                 <w:sz w:val="17"/>
               </w:rPr>
-              <w:t>Statis, tidak mempertimbangkan urutan waktu serangan.</w:t>
+              <w:t>Terbatas pada data tabular / game sederhana.</w:t>
             </w:r>
           </w:p>
         </w:tc>
@@ -1315,7 +1275,7 @@
                 <w:i w:val="0"/>
                 <w:sz w:val="17"/>
               </w:rPr>
-              <w:t>Menggunakan Temporal Graph Attention Network (TGAT).</w:t>
+              <w:t>Menerapkan Neuro-Symbolic pada visual forensik resolusi tinggi.</w:t>
             </w:r>
           </w:p>
         </w:tc>
@@ -1339,7 +1299,7 @@
                 <w:i w:val="0"/>
                 <w:sz w:val="17"/>
               </w:rPr>
-              <w:t>Al-Dhaqm et al. (2025)</w:t>
+              <w:t>Setyadi et al. (2024–2026)</w:t>
             </w:r>
           </w:p>
         </w:tc>
@@ -1361,7 +1321,7 @@
                 <w:i w:val="0"/>
                 <w:sz w:val="17"/>
               </w:rPr>
-              <w:t>Digital Forensic Database Models</w:t>
+              <w:t>Vision DL (ConvNeXt/EfficientNet)</w:t>
             </w:r>
           </w:p>
         </w:tc>
@@ -1383,7 +1343,7 @@
                 <w:i w:val="0"/>
                 <w:sz w:val="17"/>
               </w:rPr>
-              <w:t>Standarisasi metamodel bukti digital.</w:t>
+              <w:t>Keahlian kuat vision, CNN modern, &amp; security.</w:t>
             </w:r>
           </w:p>
         </w:tc>
@@ -1405,7 +1365,7 @@
                 <w:i w:val="0"/>
                 <w:sz w:val="17"/>
               </w:rPr>
-              <w:t>Tidak memiliki kemampuan inferensi dan rekonstruksi otonom.</w:t>
+              <w:t>Belum mengintegrasikan penalaran simbolik &amp; CBM.</w:t>
             </w:r>
           </w:p>
         </w:tc>
@@ -1427,7 +1387,7 @@
                 <w:i w:val="0"/>
                 <w:sz w:val="17"/>
               </w:rPr>
-              <w:t>Menggabungkan metamodel bukti dengan mesin penalaran deep learning.</w:t>
+              <w:t>Evolusi ke level doktoral: Neuro-Symbolic Concept Bottleneck.</w:t>
             </w:r>
           </w:p>
         </w:tc>
@@ -1475,7 +1435,7 @@
                 <w:i w:val="0"/>
                 <w:sz w:val="17"/>
               </w:rPr>
-              <w:t>Autonomous Cloud Forensics (CSPG+TGAT)</w:t>
+              <w:t>Neuro-Symbolic CBM + Spatial Mining</w:t>
             </w:r>
           </w:p>
         </w:tc>
@@ -1498,7 +1458,7 @@
                 <w:i w:val="0"/>
                 <w:sz w:val="17"/>
               </w:rPr>
-              <w:t>Ringan (eBPF), adaptif pada ephemeral containers, reduksi log &gt; 95%.</w:t>
+              <w:t>Akurasi tinggi, tahan kompresi, 100% transparan, sah di pengadilan.</w:t>
             </w:r>
           </w:p>
         </w:tc>
@@ -1544,7 +1504,7 @@
                 <w:i w:val="0"/>
                 <w:sz w:val="17"/>
               </w:rPr>
-              <w:t>Menghadirkan framework investigasi forensik digital otonom terpadu.</w:t>
+              <w:t>Framework deteksi pemalsuan citra Gen-AI yang transparan &amp; court-admissible.</w:t>
             </w:r>
           </w:p>
         </w:tc>
@@ -1582,7 +1542,112 @@
           <w:i w:val="0"/>
           <w:sz w:val="24"/>
         </w:rPr>
-        <w:t>Penelitian ini mengadopsi Design Science Research Methodology (DSRM) dalam 5 fase: (1) Problem Identification, (2) Objectives of a Solution, (3) Design &amp; Development, (4) Demonstration, dan (5) Evaluation.</w:t>
+        <w:t>Penelitian ini mengadopsi Design Science Research Methodology (DSRM) dalam 5 fase terstruktur:</w:t>
+      </w:r>
+    </w:p>
+    <w:p>
+      <w:pPr>
+        <w:spacing w:before="0" w:after="120" w:line="360" w:lineRule="auto"/>
+        <w:jc w:val="both"/>
+      </w:pPr>
+      <w:r>
+        <w:rPr>
+          <w:rFonts w:ascii="Times New Roman" w:hAnsi="Times New Roman" w:eastAsia="Times New Roman"/>
+          <w:b w:val="0"/>
+          <w:i w:val="0"/>
+          <w:sz w:val="24"/>
+        </w:rPr>
+        <w:t>Fase 1: Problem Identification &amp; Forensic Taxonomy Formulation</w:t>
+      </w:r>
+    </w:p>
+    <w:p>
+      <w:pPr>
+        <w:spacing w:before="0" w:after="120" w:line="360" w:lineRule="auto"/>
+        <w:jc w:val="both"/>
+      </w:pPr>
+      <w:r>
+        <w:rPr>
+          <w:rFonts w:ascii="Times New Roman" w:hAnsi="Times New Roman" w:eastAsia="Times New Roman"/>
+          <w:b w:val="0"/>
+          <w:i w:val="0"/>
+          <w:sz w:val="24"/>
+        </w:rPr>
+        <w:t>Fase 2: Objectives of a Solution &amp; ISO/IEC 27037 Compliance</w:t>
+      </w:r>
+    </w:p>
+    <w:p>
+      <w:pPr>
+        <w:spacing w:before="0" w:after="120" w:line="360" w:lineRule="auto"/>
+        <w:jc w:val="both"/>
+      </w:pPr>
+      <w:r>
+        <w:rPr>
+          <w:rFonts w:ascii="Times New Roman" w:hAnsi="Times New Roman" w:eastAsia="Times New Roman"/>
+          <w:b w:val="0"/>
+          <w:i w:val="0"/>
+          <w:sz w:val="24"/>
+        </w:rPr>
+        <w:t>Fase 3: Design &amp; Development (Spatial Miner, Concept Bottleneck, Symbolic Logic Engine)</w:t>
+      </w:r>
+    </w:p>
+    <w:p>
+      <w:pPr>
+        <w:spacing w:before="0" w:after="120" w:line="360" w:lineRule="auto"/>
+        <w:jc w:val="both"/>
+      </w:pPr>
+      <w:r>
+        <w:rPr>
+          <w:rFonts w:ascii="Times New Roman" w:hAnsi="Times New Roman" w:eastAsia="Times New Roman"/>
+          <w:b w:val="0"/>
+          <w:i w:val="0"/>
+          <w:sz w:val="24"/>
+        </w:rPr>
+        <w:t>Fase 4: Demonstration (Uji Forensik Multi-Generator pada Diffusion &amp; GAN Images)</w:t>
+      </w:r>
+    </w:p>
+    <w:p>
+      <w:pPr>
+        <w:spacing w:before="0" w:after="120" w:line="360" w:lineRule="auto"/>
+        <w:jc w:val="both"/>
+      </w:pPr>
+      <w:r>
+        <w:rPr>
+          <w:rFonts w:ascii="Times New Roman" w:hAnsi="Times New Roman" w:eastAsia="Times New Roman"/>
+          <w:b w:val="0"/>
+          <w:i w:val="0"/>
+          <w:sz w:val="24"/>
+        </w:rPr>
+        <w:t>Fase 5: Evaluation (Akurasi, F1-Score Konsep, Robustness Kompresi JPEG, &amp; Expert Trust)</w:t>
+      </w:r>
+    </w:p>
+    <w:p>
+      <w:pPr>
+        <w:spacing w:before="0" w:after="120" w:line="360" w:lineRule="auto"/>
+        <w:jc w:val="both"/>
+      </w:pPr>
+      <w:r>
+        <w:rPr>
+          <w:rFonts w:ascii="Times New Roman" w:hAnsi="Times New Roman" w:eastAsia="Times New Roman"/>
+          <w:b w:val="0"/>
+          <w:i w:val="0"/>
+          <w:sz w:val="24"/>
+        </w:rPr>
+        <w:t>Formulasi Matematis Objektif Pelatihan Terpadu:</w:t>
+      </w:r>
+    </w:p>
+    <w:p>
+      <w:pPr>
+        <w:spacing w:before="0" w:after="120" w:line="360" w:lineRule="auto"/>
+        <w:jc w:val="center"/>
+      </w:pPr>
+      <w:r>
+        <w:rPr>
+          <w:rFonts w:ascii="Times New Roman" w:hAnsi="Times New Roman" w:eastAsia="Times New Roman"/>
+          <w:b/>
+          <w:i w:val="0"/>
+          <w:sz w:val="22"/>
+        </w:rPr>
+        <w:t>L_total = L_task(y, y_hat) + λ_1 · Σ L_concept(c_k, c_hat_k) + λ_2 · L_symbolic(c)</w:t>
       </w:r>
     </w:p>
     <w:p>
@@ -1723,7 +1788,7 @@
                 <w:i w:val="0"/>
                 <w:sz w:val="18"/>
               </w:rPr>
-              <w:t>Studi Teori Digital Forensik, eBPF Tracing, &amp; Filsafat Ilmu</w:t>
+              <w:t>Studi Sistematik Literatur (SLR), Taksonomi Konsep Forensik AI, &amp; Dataset</w:t>
             </w:r>
           </w:p>
         </w:tc>
@@ -1745,7 +1810,7 @@
                 <w:i w:val="0"/>
                 <w:sz w:val="18"/>
               </w:rPr>
-              <w:t>Draft Systematic Literature Review (SOTA)</w:t>
+              <w:t>Draft Systematic Literature Review Paper</w:t>
             </w:r>
           </w:p>
         </w:tc>
@@ -1791,7 +1856,7 @@
                 <w:i w:val="0"/>
                 <w:sz w:val="18"/>
               </w:rPr>
-              <w:t>Pembangunan Generator Dataset Jejak Serangan Cloud &amp; Baseline GNN</w:t>
+              <w:t>Modul Spatial Feature Mining &amp; Pelatihan Baseline Concept Bottleneck Model</w:t>
             </w:r>
           </w:p>
         </w:tc>
@@ -1859,7 +1924,7 @@
                 <w:i w:val="0"/>
                 <w:sz w:val="18"/>
               </w:rPr>
-              <w:t>Ujian Sidang Proposal Disertasi &amp; Pengembangan Engine TGAT Kausal</w:t>
+              <w:t>Ujian Sidang Proposal Disertasi &amp; Mesin Penalaran Neuro-Symbolic Logic</w:t>
             </w:r>
           </w:p>
         </w:tc>
@@ -1927,7 +1992,7 @@
                 <w:i w:val="0"/>
                 <w:sz w:val="18"/>
               </w:rPr>
-              <w:t>Eksperimen Reduksi Graf, Rekonstruksi Serangan, &amp; Validasi Forensik</w:t>
+              <w:t>Eksperimen Validasi Robustness, Uji Komparasi SOTA, &amp; Validasi Pakar Hukum</w:t>
             </w:r>
           </w:p>
         </w:tc>
@@ -1949,7 +2014,7 @@
                 <w:i w:val="0"/>
                 <w:sz w:val="18"/>
               </w:rPr>
-              <w:t>Publikasi 2: Jurnal Scopus Q1/Q2 (Disertasi III, e.g. IEEE TIFS / FSI)</w:t>
+              <w:t>Publikasi 2: Jurnal Scopus Q1 (Disertasi III, e.g. IEEE TIFS / TMM)</w:t>
             </w:r>
           </w:p>
         </w:tc>
@@ -2063,7 +2128,7 @@
                 <w:i w:val="0"/>
                 <w:sz w:val="18"/>
               </w:rPr>
-              <w:t>Perbaikan Naskah, Ujian Sidang Terbuka / Promosi Doktor &amp; Wisuda</w:t>
+              <w:t>Perbaikan Naskah, Sidang Ujian Terbuka / Promosi Doktor, dan Wisuda</w:t>
             </w:r>
           </w:p>
         </w:tc>
@@ -2124,7 +2189,7 @@
           <w:i w:val="0"/>
           <w:sz w:val="20"/>
         </w:rPr>
-        <w:t>Al-Dhaqm, A., et al. (2025). A Metamodeling Framework for Cloud Digital Forensics Investigation. Journal of King Saud University - Computer and Information Sciences, 37(2), 101890.</w:t>
+        <w:t>Corvi, R., et al. (2023). On the Detection of Synthetic Images Generated by Diffusion Models. IEEE ICASSP, 1-5.</w:t>
       </w:r>
     </w:p>
     <w:p>
@@ -2140,7 +2205,7 @@
           <w:i w:val="0"/>
           <w:sz w:val="20"/>
         </w:rPr>
-        <w:t>Hossain, M. N., et al. (2022). Dependence-Preserving Data Compaction for Scalable Forensic Analysis. USENIX Security Symposium, 1723-1740.</w:t>
+        <w:t>Dash, T., et al. (2024). A Review of Neuro-Symbolic Machine Learning and Its Applications. Artificial Intelligence Review, 57(2), 1-45.</w:t>
       </w:r>
     </w:p>
     <w:p>
@@ -2156,7 +2221,7 @@
           <w:i w:val="0"/>
           <w:sz w:val="20"/>
         </w:rPr>
-        <w:t>Setyadi, H. J., et al. (2025). Perancangan dan Pengembangan Infrastruktur Continuous Integration / Continuos Deployment Menggunakan Jenkins dan Docker. Jurnal Tekno Kompak, 19(1), 45-56.</w:t>
+        <w:t>Garcez, A. d., &amp; Lamb, L. C. (2023). Neurosymbolic AI: The 3rd Wave. Artificial Intelligence, 320, 103975.</w:t>
       </w:r>
     </w:p>
     <w:p>
@@ -2172,7 +2237,7 @@
           <w:i w:val="0"/>
           <w:sz w:val="20"/>
         </w:rPr>
-        <w:t>Setyadi, H. J., et al. (2024). Implementasi Penetration Testing Pada Sistem Informasi Terpadu Layanan Prodi Menggunakan Framework ISSAF. Techno (Jurnal FT UMP), 25(2), 112-125.</w:t>
+        <w:t>Koh, P. W., et al. (2020). Concept Bottleneck Models. International Conference on Machine Learning (ICML), PMLR, 5338-5348.</w:t>
       </w:r>
     </w:p>
     <w:p>
@@ -2188,7 +2253,39 @@
           <w:i w:val="0"/>
           <w:sz w:val="20"/>
         </w:rPr>
-        <w:t>Wang, X., et al. (2024). Temporal Graph Neural Networks for Attack Storyline Reconstruction in Enterprise Systems. IEEE Transactions on Information Forensics and Security, 19, 3120-3135.</w:t>
+        <w:t>Marconato, E., et al. (2022). Glance-and-Focus: A Neuro-Symbolic Approach to Concept Bottleneck Models. NeurIPS, 35, 24341-24353.</w:t>
+      </w:r>
+    </w:p>
+    <w:p>
+      <w:pPr>
+        <w:spacing w:before="40" w:after="80" w:line="360" w:lineRule="auto"/>
+        <w:ind w:left="576" w:hanging="576"/>
+        <w:jc w:val="both"/>
+      </w:pPr>
+      <w:r>
+        <w:rPr>
+          <w:rFonts w:ascii="Times New Roman" w:hAnsi="Times New Roman" w:eastAsia="Times New Roman"/>
+          <w:b w:val="0"/>
+          <w:i w:val="0"/>
+          <w:sz w:val="20"/>
+        </w:rPr>
+        <w:t>Setyadi, H. J., et al. (2026). Deep Learning Methods for Medical and Spatial Feature Classification Using Modern Architectures. International Journal of Computer Science &amp; Information Technology, 12(1), 88-99.</w:t>
+      </w:r>
+    </w:p>
+    <w:p>
+      <w:pPr>
+        <w:spacing w:before="40" w:after="80" w:line="360" w:lineRule="auto"/>
+        <w:ind w:left="576" w:hanging="576"/>
+        <w:jc w:val="both"/>
+      </w:pPr>
+      <w:r>
+        <w:rPr>
+          <w:rFonts w:ascii="Times New Roman" w:hAnsi="Times New Roman" w:eastAsia="Times New Roman"/>
+          <w:b w:val="0"/>
+          <w:i w:val="0"/>
+          <w:sz w:val="20"/>
+        </w:rPr>
+        <w:t>Wang, S. Y., et al. (2020). CNN-Generated Images are Surprisingly Easy to Spot... for Now. IEEE/CVF CVPR, 8695-8704.</w:t>
       </w:r>
     </w:p>
     <w:sectPr>

</xml_diff>